<commit_message>
docs: remove Nginx Proxy Manager and focus on 3 clean containers
</commit_message>
<xml_diff>
--- a/homework/Home Work-Docker-Containers.docx
+++ b/homework/Home Work-Docker-Containers.docx
@@ -26,14 +26,14 @@
           </w:tcPr>
           <w:p>
             <w:pPr>
-              <w:spacing w:before="120" w:after="40"/>
+              <w:spacing w:before="80" w:after="80"/>
             </w:pPr>
             <w:r>
               <w:rPr>
                 <w:rFonts w:ascii="Calibri" w:hAnsi="Calibri"/>
                 <w:b/>
                 <w:i w:val="0"/>
-                <w:color w:val="282828"/>
+                <w:color w:val="1E293B"/>
                 <w:sz w:val="21"/>
               </w:rPr>
               <w:t xml:space="preserve">Name: </w:t>
@@ -43,7 +43,7 @@
                 <w:rFonts w:ascii="Calibri" w:hAnsi="Calibri"/>
                 <w:b w:val="0"/>
                 <w:i w:val="0"/>
-                <w:color w:val="282828"/>
+                <w:color w:val="1E293B"/>
                 <w:sz w:val="21"/>
               </w:rPr>
               <w:t>Lorn David</w:t>
@@ -54,7 +54,7 @@
                 <w:rFonts w:ascii="Calibri" w:hAnsi="Calibri"/>
                 <w:b/>
                 <w:i w:val="0"/>
-                <w:color w:val="282828"/>
+                <w:color w:val="1E293B"/>
                 <w:sz w:val="21"/>
               </w:rPr>
               <w:t xml:space="preserve">ID: </w:t>
@@ -64,7 +64,7 @@
                 <w:rFonts w:ascii="Calibri" w:hAnsi="Calibri"/>
                 <w:b w:val="0"/>
                 <w:i w:val="0"/>
-                <w:color w:val="282828"/>
+                <w:color w:val="1E293B"/>
                 <w:sz w:val="21"/>
               </w:rPr>
               <w:t>DIT2024139</w:t>
@@ -75,7 +75,7 @@
                 <w:rFonts w:ascii="Calibri" w:hAnsi="Calibri"/>
                 <w:b/>
                 <w:i w:val="0"/>
-                <w:color w:val="282828"/>
+                <w:color w:val="1E293B"/>
                 <w:sz w:val="21"/>
               </w:rPr>
               <w:t xml:space="preserve">Class: </w:t>
@@ -85,31 +85,10 @@
                 <w:rFonts w:ascii="Calibri" w:hAnsi="Calibri"/>
                 <w:b w:val="0"/>
                 <w:i w:val="0"/>
-                <w:color w:val="282828"/>
+                <w:color w:val="1E293B"/>
                 <w:sz w:val="21"/>
               </w:rPr>
               <w:t>PG-A</w:t>
-              <w:br/>
-            </w:r>
-            <w:r>
-              <w:rPr>
-                <w:rFonts w:ascii="Calibri" w:hAnsi="Calibri"/>
-                <w:b/>
-                <w:i w:val="0"/>
-                <w:color w:val="282828"/>
-                <w:sz w:val="21"/>
-              </w:rPr>
-              <w:t xml:space="preserve">Subject: </w:t>
-            </w:r>
-            <w:r>
-              <w:rPr>
-                <w:rFonts w:ascii="Calibri" w:hAnsi="Calibri"/>
-                <w:b w:val="0"/>
-                <w:i w:val="0"/>
-                <w:color w:val="282828"/>
-                <w:sz w:val="21"/>
-              </w:rPr>
-              <w:t>Docker Three Containers &amp; Cloud</w:t>
             </w:r>
           </w:p>
         </w:tc>
@@ -119,7 +98,7 @@
           </w:tcPr>
           <w:p>
             <w:pPr>
-              <w:spacing w:before="360"/>
+              <w:spacing w:before="280"/>
               <w:jc w:val="center"/>
             </w:pPr>
             <w:r>
@@ -128,9 +107,9 @@
                 <w:b/>
                 <w:i w:val="0"/>
                 <w:color w:val="0F3460"/>
-                <w:sz w:val="36"/>
+                <w:sz w:val="40"/>
               </w:rPr>
-              <w:t>HOMEWORK REPORT</w:t>
+              <w:t>Home Work</w:t>
               <w:br/>
             </w:r>
             <w:r>
@@ -139,9 +118,9 @@
                 <w:b/>
                 <w:i w:val="0"/>
                 <w:color w:val="1679AB"/>
-                <w:sz w:val="22"/>
+                <w:sz w:val="21"/>
               </w:rPr>
-              <w:t>Docker 3-Tier Architecture &amp; VPS Deployment</w:t>
+              <w:t>Docker Three Containers &amp; Cloud Deployment</w:t>
             </w:r>
           </w:p>
         </w:tc>
@@ -149,12 +128,12 @@
     </w:tbl>
     <w:p>
       <w:pPr>
-        <w:spacing w:after="240"/>
+        <w:spacing w:after="160"/>
       </w:pPr>
     </w:p>
     <w:p>
       <w:pPr>
-        <w:spacing w:before="240" w:after="80"/>
+        <w:spacing w:before="160" w:after="40"/>
       </w:pPr>
       <w:r>
         <w:rPr>
@@ -162,14 +141,14 @@
           <w:b/>
           <w:i w:val="0"/>
           <w:color w:val="0F3460"/>
-          <w:sz w:val="28"/>
+          <w:sz w:val="26"/>
         </w:rPr>
         <w:t>1. How to Download and Install Docker</w:t>
       </w:r>
     </w:p>
     <w:p>
       <w:pPr>
-        <w:spacing w:before="120" w:after="40"/>
+        <w:spacing w:before="80" w:after="20"/>
       </w:pPr>
       <w:r>
         <w:rPr>
@@ -177,7 +156,7 @@
           <w:b/>
           <w:i w:val="0"/>
           <w:color w:val="1679AB"/>
-          <w:sz w:val="24"/>
+          <w:sz w:val="23"/>
         </w:rPr>
         <w:t>1.1 On Windows</w:t>
       </w:r>
@@ -188,191 +167,96 @@
           <w:rFonts w:ascii="Calibri" w:hAnsi="Calibri"/>
           <w:b/>
           <w:i w:val="0"/>
-          <w:color w:val="282828"/>
+          <w:color w:val="1E293B"/>
           <w:sz w:val="22"/>
         </w:rPr>
-        <w:t xml:space="preserve">• System Prerequisites: </w:t>
+        <w:t xml:space="preserve">• Prerequisites: </w:t>
       </w:r>
       <w:r>
         <w:rPr>
           <w:rFonts w:ascii="Calibri" w:hAnsi="Calibri"/>
           <w:b w:val="0"/>
           <w:i w:val="0"/>
-          <w:color w:val="282828"/>
+          <w:color w:val="1E293B"/>
           <w:sz w:val="22"/>
         </w:rPr>
-        <w:t>Enable WSL 2 (Windows Subsystem for Linux) and Hardware Virtualization in BIOS / Windows Features.</w:t>
+        <w:t>Enable WSL 2 (Windows Subsystem for Linux) and Hardware Virtualization in BIOS / Task Manager.</w:t>
       </w:r>
     </w:p>
     <w:p>
-      <w:pPr>
-        <w:spacing w:after="40"/>
-      </w:pPr>
       <w:r>
         <w:rPr>
           <w:rFonts w:ascii="Calibri" w:hAnsi="Calibri"/>
           <w:b/>
           <w:i w:val="0"/>
-          <w:color w:val="282828"/>
+          <w:color w:val="1E293B"/>
           <w:sz w:val="22"/>
         </w:rPr>
-        <w:t>• Step-by-Step Installation:</w:t>
-      </w:r>
-    </w:p>
-    <w:p>
-      <w:pPr>
-        <w:spacing w:after="40"/>
-        <w:ind w:left="360"/>
-      </w:pPr>
-      <w:r>
-        <w:rPr>
-          <w:rFonts w:ascii="Calibri" w:hAnsi="Calibri"/>
-          <w:b/>
-          <w:i w:val="0"/>
-          <w:color w:val="282828"/>
-          <w:sz w:val="22"/>
-        </w:rPr>
-        <w:t xml:space="preserve">1. </w:t>
+        <w:t>• Installation Steps:</w:t>
+        <w:br/>
       </w:r>
       <w:r>
         <w:rPr>
           <w:rFonts w:ascii="Calibri" w:hAnsi="Calibri"/>
           <w:b w:val="0"/>
           <w:i w:val="0"/>
-          <w:color w:val="282828"/>
+          <w:color w:val="1E293B"/>
           <w:sz w:val="22"/>
         </w:rPr>
-        <w:t>Visit the official Docker website: https://www.docker.com/products/docker-desktop</w:t>
+        <w:t xml:space="preserve">  1. Visit official website: </w:t>
       </w:r>
-    </w:p>
-    <w:p>
-      <w:pPr>
-        <w:spacing w:after="40"/>
-        <w:ind w:left="360"/>
-      </w:pPr>
+      <w:hyperlink r:id="rId9" w:history="1">
+        <w:r>
+          <w:rPr>
+            <w:color w:val="1679AB"/>
+            <w:u w:val="single"/>
+          </w:rPr>
+          <w:t>docker.com/products/docker-desktop</w:t>
+        </w:r>
+      </w:hyperlink>
       <w:r>
         <w:rPr>
           <w:rFonts w:ascii="Calibri" w:hAnsi="Calibri"/>
-          <w:b/>
+          <w:b w:val="0"/>
           <w:i w:val="0"/>
-          <w:color w:val="282828"/>
+          <w:color w:val="1E293B"/>
           <w:sz w:val="22"/>
         </w:rPr>
-        <w:t xml:space="preserve">2. </w:t>
+        <w:br/>
+        <w:t xml:space="preserve">  2. Click 'Download for Windows' (Docker Desktop Installer.exe).</w:t>
       </w:r>
       <w:r>
         <w:rPr>
           <w:rFonts w:ascii="Calibri" w:hAnsi="Calibri"/>
           <w:b w:val="0"/>
           <w:i w:val="0"/>
-          <w:color w:val="282828"/>
+          <w:color w:val="1E293B"/>
           <w:sz w:val="22"/>
         </w:rPr>
-        <w:t>Click the button 'Download for Windows' to download Docker Desktop Installer.exe.</w:t>
-      </w:r>
-    </w:p>
-    <w:p>
-      <w:pPr>
-        <w:spacing w:after="40"/>
-        <w:ind w:left="360"/>
-      </w:pPr>
-      <w:r>
-        <w:rPr>
-          <w:rFonts w:ascii="Calibri" w:hAnsi="Calibri"/>
-          <w:b/>
-          <w:i w:val="0"/>
-          <w:color w:val="282828"/>
-          <w:sz w:val="22"/>
-        </w:rPr>
-        <w:t xml:space="preserve">3. </w:t>
+        <w:br/>
+        <w:t xml:space="preserve">  3. Run the installer and choose 'Use WSL 2 instead of Hyper-V (recommended)'.</w:t>
       </w:r>
       <w:r>
         <w:rPr>
           <w:rFonts w:ascii="Calibri" w:hAnsi="Calibri"/>
           <w:b w:val="0"/>
           <w:i w:val="0"/>
-          <w:color w:val="282828"/>
+          <w:color w:val="1E293B"/>
           <w:sz w:val="22"/>
         </w:rPr>
-        <w:t>Run the installer and make sure to select 'Use WSL 2 instead of Hyper-V (recommended)'.</w:t>
-      </w:r>
-    </w:p>
-    <w:p>
-      <w:pPr>
-        <w:spacing w:after="40"/>
-        <w:ind w:left="360"/>
-      </w:pPr>
-      <w:r>
-        <w:rPr>
-          <w:rFonts w:ascii="Calibri" w:hAnsi="Calibri"/>
-          <w:b/>
-          <w:i w:val="0"/>
-          <w:color w:val="282828"/>
-          <w:sz w:val="22"/>
-        </w:rPr>
-        <w:t xml:space="preserve">4. </w:t>
+        <w:br/>
+        <w:t xml:space="preserve">  4. Wait for install to complete, then click 'Close and restart' your computer.</w:t>
       </w:r>
       <w:r>
         <w:rPr>
           <w:rFonts w:ascii="Calibri" w:hAnsi="Calibri"/>
           <w:b w:val="0"/>
           <w:i w:val="0"/>
-          <w:color w:val="282828"/>
+          <w:color w:val="1E293B"/>
           <w:sz w:val="22"/>
         </w:rPr>
-        <w:t>Wait for the installation process to complete, then click 'Close and restart' your computer.</w:t>
-      </w:r>
-    </w:p>
-    <w:p>
-      <w:pPr>
-        <w:spacing w:after="40"/>
-        <w:ind w:left="360"/>
-      </w:pPr>
-      <w:r>
-        <w:rPr>
-          <w:rFonts w:ascii="Calibri" w:hAnsi="Calibri"/>
-          <w:b/>
-          <w:i w:val="0"/>
-          <w:color w:val="282828"/>
-          <w:sz w:val="22"/>
-        </w:rPr>
-        <w:t xml:space="preserve">5. </w:t>
-      </w:r>
-      <w:r>
-        <w:rPr>
-          <w:rFonts w:ascii="Calibri" w:hAnsi="Calibri"/>
-          <w:b w:val="0"/>
-          <w:i w:val="0"/>
-          <w:color w:val="282828"/>
-          <w:sz w:val="22"/>
-        </w:rPr>
-        <w:t>After the computer boots up, launch Docker Desktop and accept the service agreement.</w:t>
-      </w:r>
-    </w:p>
-    <w:p>
-      <w:pPr>
-        <w:spacing w:after="40"/>
-        <w:ind w:left="360"/>
-      </w:pPr>
-      <w:r>
-        <w:rPr>
-          <w:rFonts w:ascii="Calibri" w:hAnsi="Calibri"/>
-          <w:b/>
-          <w:i w:val="0"/>
-          <w:color w:val="282828"/>
-          <w:sz w:val="22"/>
-        </w:rPr>
-        <w:t xml:space="preserve">6. </w:t>
-      </w:r>
-      <w:r>
-        <w:rPr>
-          <w:rFonts w:ascii="Calibri" w:hAnsi="Calibri"/>
-          <w:b w:val="0"/>
-          <w:i w:val="0"/>
-          <w:color w:val="282828"/>
-          <w:sz w:val="22"/>
-        </w:rPr>
-        <w:t>Open PowerShell or Command Prompt (cmd) and run the verification command:</w:t>
+        <w:br/>
+        <w:t xml:space="preserve">  5. Open Docker Desktop and verify in terminal:</w:t>
       </w:r>
     </w:p>
     <w:tbl>
@@ -388,10 +272,10 @@
         <w:tc>
           <w:tcPr>
             <w:tcW w:type="dxa" w:w="9792"/>
-            <w:shd w:fill="F3F4F6"/>
+            <w:shd w:fill="F1F5F9"/>
             <w:tcBorders>
               <w:top w:val="single" w:sz="4" w:space="0" w:color="CBD5E1"/>
-              <w:left w:val="single" w:sz="18" w:space="0" w:color="1679AB"/>
+              <w:left w:val="single" w:sz="16" w:space="0" w:color="1679AB"/>
               <w:bottom w:val="single" w:sz="4" w:space="0" w:color="CBD5E1"/>
               <w:right w:val="single" w:sz="4" w:space="0" w:color="CBD5E1"/>
             </w:tcBorders>
@@ -424,12 +308,12 @@
     </w:tbl>
     <w:p>
       <w:pPr>
-        <w:spacing w:after="80"/>
+        <w:spacing w:after="40"/>
       </w:pPr>
     </w:p>
     <w:p>
       <w:pPr>
-        <w:spacing w:before="160" w:after="40"/>
+        <w:spacing w:before="120" w:after="20"/>
       </w:pPr>
       <w:r>
         <w:rPr>
@@ -437,7 +321,7 @@
           <w:b/>
           <w:i w:val="0"/>
           <w:color w:val="1679AB"/>
-          <w:sz w:val="24"/>
+          <w:sz w:val="23"/>
         </w:rPr>
         <w:t>1.2 On Linux (Ubuntu / Debian VPS)</w:t>
       </w:r>
@@ -448,26 +332,10 @@
           <w:rFonts w:ascii="Calibri" w:hAnsi="Calibri"/>
           <w:b w:val="0"/>
           <w:i w:val="0"/>
-          <w:color w:val="282828"/>
+          <w:color w:val="1E293B"/>
           <w:sz w:val="22"/>
         </w:rPr>
-        <w:t>On Linux, Docker Engine is installed via Command Line (Terminal) using the official APT repository:</w:t>
-      </w:r>
-    </w:p>
-    <w:p>
-      <w:pPr>
-        <w:spacing w:after="40"/>
-        <w:ind w:left="288"/>
-      </w:pPr>
-      <w:r>
-        <w:rPr>
-          <w:rFonts w:ascii="Calibri" w:hAnsi="Calibri"/>
-          <w:b/>
-          <w:i w:val="0"/>
-          <w:color w:val="282828"/>
-          <w:sz w:val="22"/>
-        </w:rPr>
-        <w:t>1. Remove old or conflicting packages (if any):</w:t>
+        <w:t>Install Docker Engine and Docker Compose via Terminal with APT repository:</w:t>
       </w:r>
     </w:p>
     <w:tbl>
@@ -483,10 +351,10 @@
         <w:tc>
           <w:tcPr>
             <w:tcW w:type="dxa" w:w="9792"/>
-            <w:shd w:fill="F3F4F6"/>
+            <w:shd w:fill="F1F5F9"/>
             <w:tcBorders>
               <w:top w:val="single" w:sz="4" w:space="0" w:color="CBD5E1"/>
-              <w:left w:val="single" w:sz="18" w:space="0" w:color="1679AB"/>
+              <w:left w:val="single" w:sz="16" w:space="0" w:color="1679AB"/>
               <w:bottom w:val="single" w:sz="4" w:space="0" w:color="CBD5E1"/>
               <w:right w:val="single" w:sz="4" w:space="0" w:color="CBD5E1"/>
             </w:tcBorders>
@@ -504,7 +372,34 @@
                 <w:color w:val="1E293B"/>
                 <w:sz w:val="19"/>
               </w:rPr>
-              <w:t>sudo apt remove docker docker-engine docker.io containerd runc</w:t>
+              <w:t># 1. Update and install required tools</w:t>
+              <w:br/>
+              <w:t>sudo apt update &amp;&amp; sudo apt install -y ca-certificates curl gnupg lsb-release</w:t>
+              <w:br/>
+              <w:br/>
+              <w:t># 2. Add Docker Official GPG Key &amp; Repository</w:t>
+              <w:br/>
+              <w:t>sudo install -m 0755 -d /etc/apt/keyrings</w:t>
+              <w:br/>
+              <w:t>curl -fsSL https://download.docker.com/linux/ubuntu/gpg | sudo gpg --dearmor -o /etc/apt/keyrings/docker.gpg</w:t>
+              <w:br/>
+              <w:t>sudo chmod a+r /etc/apt/keyrings/docker.gpg</w:t>
+              <w:br/>
+              <w:t>echo "deb [arch=$(dpkg --print-architecture) signed-by=/etc/apt/keyrings/docker.gpg] https://download.docker.com/linux/ubuntu $(lsb_release -cs) stable" | sudo tee /etc/apt/sources.list.d/docker.list &gt; /dev/null</w:t>
+              <w:br/>
+              <w:br/>
+              <w:t># 3. Install Docker Engine and Compose Plugin</w:t>
+              <w:br/>
+              <w:t>sudo apt update</w:t>
+              <w:br/>
+              <w:t>sudo apt install -y docker-ce docker-ce-cli containerd.io docker-compose-plugin</w:t>
+              <w:br/>
+              <w:br/>
+              <w:t># 4. Enable non-root user and check version</w:t>
+              <w:br/>
+              <w:t>sudo usermod -aG docker $USER &amp;&amp; newgrp docker</w:t>
+              <w:br/>
+              <w:t>docker --version</w:t>
             </w:r>
           </w:p>
         </w:tc>
@@ -512,23 +407,105 @@
     </w:tbl>
     <w:p>
       <w:pPr>
-        <w:spacing w:after="80"/>
+        <w:spacing w:after="40"/>
       </w:pPr>
     </w:p>
     <w:p>
       <w:pPr>
-        <w:spacing w:after="40"/>
-        <w:ind w:left="288"/>
+        <w:spacing w:before="160" w:after="40"/>
       </w:pPr>
       <w:r>
         <w:rPr>
           <w:rFonts w:ascii="Calibri" w:hAnsi="Calibri"/>
           <w:b/>
           <w:i w:val="0"/>
-          <w:color w:val="282828"/>
+          <w:color w:val="0F3460"/>
+          <w:sz w:val="26"/>
+        </w:rPr>
+        <w:t>2. Create Docker Hub Account, Pull &amp; Push Images (3 Containers)</w:t>
+      </w:r>
+    </w:p>
+    <w:p>
+      <w:r>
+        <w:rPr>
+          <w:rFonts w:ascii="Calibri" w:hAnsi="Calibri"/>
+          <w:b/>
+          <w:i w:val="0"/>
+          <w:color w:val="1679AB"/>
           <w:sz w:val="22"/>
         </w:rPr>
-        <w:t>2. Update package lists and install prerequisite utilities:</w:t>
+        <w:t xml:space="preserve">2.1 Create Docker Hub Account: </w:t>
+      </w:r>
+      <w:r>
+        <w:rPr>
+          <w:rFonts w:ascii="Calibri" w:hAnsi="Calibri"/>
+          <w:b w:val="0"/>
+          <w:i w:val="0"/>
+          <w:color w:val="1E293B"/>
+          <w:sz w:val="22"/>
+        </w:rPr>
+        <w:t xml:space="preserve">Sign up at </w:t>
+      </w:r>
+      <w:hyperlink r:id="rId10" w:history="1">
+        <w:r>
+          <w:rPr>
+            <w:color w:val="1679AB"/>
+            <w:u w:val="single"/>
+          </w:rPr>
+          <w:t>hub.docker.com</w:t>
+        </w:r>
+      </w:hyperlink>
+      <w:r>
+        <w:rPr>
+          <w:rFonts w:ascii="Calibri" w:hAnsi="Calibri"/>
+          <w:b w:val="0"/>
+          <w:i w:val="0"/>
+          <w:color w:val="1E293B"/>
+          <w:sz w:val="22"/>
+        </w:rPr>
+        <w:t xml:space="preserve"> (Username: </w:t>
+      </w:r>
+      <w:r>
+        <w:rPr>
+          <w:rFonts w:ascii="Calibri" w:hAnsi="Calibri"/>
+          <w:b/>
+          <w:i w:val="0"/>
+          <w:color w:val="1E293B"/>
+          <w:sz w:val="22"/>
+        </w:rPr>
+        <w:t>lorndavid</w:t>
+      </w:r>
+      <w:r>
+        <w:rPr>
+          <w:rFonts w:ascii="Calibri" w:hAnsi="Calibri"/>
+          <w:b w:val="0"/>
+          <w:i w:val="0"/>
+          <w:color w:val="1E293B"/>
+          <w:sz w:val="22"/>
+        </w:rPr>
+        <w:t>).</w:t>
+      </w:r>
+    </w:p>
+    <w:p>
+      <w:r>
+        <w:rPr>
+          <w:rFonts w:ascii="Calibri" w:hAnsi="Calibri"/>
+          <w:b/>
+          <w:i w:val="0"/>
+          <w:color w:val="1679AB"/>
+          <w:sz w:val="22"/>
+        </w:rPr>
+        <w:t xml:space="preserve">2.2 Terminal Login: </w:t>
+      </w:r>
+      <w:r>
+        <w:rPr>
+          <w:rFonts w:ascii="Calibri" w:hAnsi="Calibri"/>
+          <w:b w:val="0"/>
+          <w:i w:val="0"/>
+          <w:color w:val="1E293B"/>
+          <w:sz w:val="22"/>
+        </w:rPr>
+        <w:t>Run `docker login` and enter credentials to authenticate.</w:t>
       </w:r>
     </w:p>
     <w:tbl>
@@ -544,519 +521,10 @@
         <w:tc>
           <w:tcPr>
             <w:tcW w:type="dxa" w:w="9792"/>
-            <w:shd w:fill="F3F4F6"/>
+            <w:shd w:fill="F1F5F9"/>
             <w:tcBorders>
               <w:top w:val="single" w:sz="4" w:space="0" w:color="CBD5E1"/>
-              <w:left w:val="single" w:sz="18" w:space="0" w:color="1679AB"/>
-              <w:bottom w:val="single" w:sz="4" w:space="0" w:color="CBD5E1"/>
-              <w:right w:val="single" w:sz="4" w:space="0" w:color="CBD5E1"/>
-            </w:tcBorders>
-          </w:tcPr>
-          <w:p>
-            <w:pPr>
-              <w:spacing w:before="80" w:after="80"/>
-              <w:ind w:left="144"/>
-            </w:pPr>
-            <w:r>
-              <w:rPr>
-                <w:rFonts w:ascii="Consolas" w:hAnsi="Consolas"/>
-                <w:b w:val="0"/>
-                <w:i w:val="0"/>
-                <w:color w:val="1E293B"/>
-                <w:sz w:val="19"/>
-              </w:rPr>
-              <w:t>sudo apt update</w:t>
-              <w:br/>
-              <w:t>sudo apt install -y ca-certificates curl gnupg lsb-release</w:t>
-            </w:r>
-          </w:p>
-        </w:tc>
-      </w:tr>
-    </w:tbl>
-    <w:p>
-      <w:pPr>
-        <w:spacing w:after="80"/>
-      </w:pPr>
-    </w:p>
-    <w:p>
-      <w:pPr>
-        <w:spacing w:after="40"/>
-        <w:ind w:left="288"/>
-      </w:pPr>
-      <w:r>
-        <w:rPr>
-          <w:rFonts w:ascii="Calibri" w:hAnsi="Calibri"/>
-          <w:b/>
-          <w:i w:val="0"/>
-          <w:color w:val="282828"/>
-          <w:sz w:val="22"/>
-        </w:rPr>
-        <w:t>3. Add Docker's official GPG key:</w:t>
-      </w:r>
-    </w:p>
-    <w:tbl>
-      <w:tblPr>
-        <w:tblW w:type="auto" w:w="0"/>
-        <w:jc w:val="center"/>
-        <w:tblLook w:firstColumn="1" w:firstRow="1" w:lastColumn="0" w:lastRow="0" w:noHBand="0" w:noVBand="1" w:val="04A0"/>
-      </w:tblPr>
-      <w:tblGrid>
-        <w:gridCol w:w="9936"/>
-      </w:tblGrid>
-      <w:tr>
-        <w:tc>
-          <w:tcPr>
-            <w:tcW w:type="dxa" w:w="9792"/>
-            <w:shd w:fill="F3F4F6"/>
-            <w:tcBorders>
-              <w:top w:val="single" w:sz="4" w:space="0" w:color="CBD5E1"/>
-              <w:left w:val="single" w:sz="18" w:space="0" w:color="1679AB"/>
-              <w:bottom w:val="single" w:sz="4" w:space="0" w:color="CBD5E1"/>
-              <w:right w:val="single" w:sz="4" w:space="0" w:color="CBD5E1"/>
-            </w:tcBorders>
-          </w:tcPr>
-          <w:p>
-            <w:pPr>
-              <w:spacing w:before="80" w:after="80"/>
-              <w:ind w:left="144"/>
-            </w:pPr>
-            <w:r>
-              <w:rPr>
-                <w:rFonts w:ascii="Consolas" w:hAnsi="Consolas"/>
-                <w:b w:val="0"/>
-                <w:i w:val="0"/>
-                <w:color w:val="1E293B"/>
-                <w:sz w:val="19"/>
-              </w:rPr>
-              <w:t>sudo install -m 0755 -d /etc/apt/keyrings</w:t>
-              <w:br/>
-              <w:t>curl -fsSL https://download.docker.com/linux/ubuntu/gpg | sudo gpg --dearmor -o /etc/apt/keyrings/docker.gpg</w:t>
-              <w:br/>
-              <w:t>sudo chmod a+r /etc/apt/keyrings/docker.gpg</w:t>
-            </w:r>
-          </w:p>
-        </w:tc>
-      </w:tr>
-    </w:tbl>
-    <w:p>
-      <w:pPr>
-        <w:spacing w:after="80"/>
-      </w:pPr>
-    </w:p>
-    <w:p>
-      <w:pPr>
-        <w:spacing w:after="40"/>
-        <w:ind w:left="288"/>
-      </w:pPr>
-      <w:r>
-        <w:rPr>
-          <w:rFonts w:ascii="Calibri" w:hAnsi="Calibri"/>
-          <w:b/>
-          <w:i w:val="0"/>
-          <w:color w:val="282828"/>
-          <w:sz w:val="22"/>
-        </w:rPr>
-        <w:t>4. Set up the official stable repository:</w:t>
-      </w:r>
-    </w:p>
-    <w:tbl>
-      <w:tblPr>
-        <w:tblW w:type="auto" w:w="0"/>
-        <w:jc w:val="center"/>
-        <w:tblLook w:firstColumn="1" w:firstRow="1" w:lastColumn="0" w:lastRow="0" w:noHBand="0" w:noVBand="1" w:val="04A0"/>
-      </w:tblPr>
-      <w:tblGrid>
-        <w:gridCol w:w="9936"/>
-      </w:tblGrid>
-      <w:tr>
-        <w:tc>
-          <w:tcPr>
-            <w:tcW w:type="dxa" w:w="9792"/>
-            <w:shd w:fill="F3F4F6"/>
-            <w:tcBorders>
-              <w:top w:val="single" w:sz="4" w:space="0" w:color="CBD5E1"/>
-              <w:left w:val="single" w:sz="18" w:space="0" w:color="1679AB"/>
-              <w:bottom w:val="single" w:sz="4" w:space="0" w:color="CBD5E1"/>
-              <w:right w:val="single" w:sz="4" w:space="0" w:color="CBD5E1"/>
-            </w:tcBorders>
-          </w:tcPr>
-          <w:p>
-            <w:pPr>
-              <w:spacing w:before="80" w:after="80"/>
-              <w:ind w:left="144"/>
-            </w:pPr>
-            <w:r>
-              <w:rPr>
-                <w:rFonts w:ascii="Consolas" w:hAnsi="Consolas"/>
-                <w:b w:val="0"/>
-                <w:i w:val="0"/>
-                <w:color w:val="1E293B"/>
-                <w:sz w:val="19"/>
-              </w:rPr>
-              <w:t>echo "deb [arch=$(dpkg --print-architecture) signed-by=/etc/apt/keyrings/docker.gpg] https://download.docker.com/linux/ubuntu $(lsb_release -cs) stable" | sudo tee /etc/apt/sources.list.d/docker.list &gt; /dev/null</w:t>
-            </w:r>
-          </w:p>
-        </w:tc>
-      </w:tr>
-    </w:tbl>
-    <w:p>
-      <w:pPr>
-        <w:spacing w:after="80"/>
-      </w:pPr>
-    </w:p>
-    <w:p>
-      <w:pPr>
-        <w:spacing w:after="40"/>
-        <w:ind w:left="288"/>
-      </w:pPr>
-      <w:r>
-        <w:rPr>
-          <w:rFonts w:ascii="Calibri" w:hAnsi="Calibri"/>
-          <w:b/>
-          <w:i w:val="0"/>
-          <w:color w:val="282828"/>
-          <w:sz w:val="22"/>
-        </w:rPr>
-        <w:t>5. Install Docker Engine, CLI, and Docker Compose plugin:</w:t>
-      </w:r>
-    </w:p>
-    <w:tbl>
-      <w:tblPr>
-        <w:tblW w:type="auto" w:w="0"/>
-        <w:jc w:val="center"/>
-        <w:tblLook w:firstColumn="1" w:firstRow="1" w:lastColumn="0" w:lastRow="0" w:noHBand="0" w:noVBand="1" w:val="04A0"/>
-      </w:tblPr>
-      <w:tblGrid>
-        <w:gridCol w:w="9936"/>
-      </w:tblGrid>
-      <w:tr>
-        <w:tc>
-          <w:tcPr>
-            <w:tcW w:type="dxa" w:w="9792"/>
-            <w:shd w:fill="F3F4F6"/>
-            <w:tcBorders>
-              <w:top w:val="single" w:sz="4" w:space="0" w:color="CBD5E1"/>
-              <w:left w:val="single" w:sz="18" w:space="0" w:color="1679AB"/>
-              <w:bottom w:val="single" w:sz="4" w:space="0" w:color="CBD5E1"/>
-              <w:right w:val="single" w:sz="4" w:space="0" w:color="CBD5E1"/>
-            </w:tcBorders>
-          </w:tcPr>
-          <w:p>
-            <w:pPr>
-              <w:spacing w:before="80" w:after="80"/>
-              <w:ind w:left="144"/>
-            </w:pPr>
-            <w:r>
-              <w:rPr>
-                <w:rFonts w:ascii="Consolas" w:hAnsi="Consolas"/>
-                <w:b w:val="0"/>
-                <w:i w:val="0"/>
-                <w:color w:val="1E293B"/>
-                <w:sz w:val="19"/>
-              </w:rPr>
-              <w:t>sudo apt update</w:t>
-              <w:br/>
-              <w:t>sudo apt install -y docker-ce docker-ce-cli containerd.io docker-buildx-plugin docker-compose-plugin</w:t>
-            </w:r>
-          </w:p>
-        </w:tc>
-      </w:tr>
-    </w:tbl>
-    <w:p>
-      <w:pPr>
-        <w:spacing w:after="80"/>
-      </w:pPr>
-    </w:p>
-    <w:p>
-      <w:pPr>
-        <w:spacing w:after="40"/>
-        <w:ind w:left="288"/>
-      </w:pPr>
-      <w:r>
-        <w:rPr>
-          <w:rFonts w:ascii="Calibri" w:hAnsi="Calibri"/>
-          <w:b/>
-          <w:i w:val="0"/>
-          <w:color w:val="282828"/>
-          <w:sz w:val="22"/>
-        </w:rPr>
-        <w:t>6. Allow regular non-root user to run Docker commands:</w:t>
-      </w:r>
-    </w:p>
-    <w:tbl>
-      <w:tblPr>
-        <w:tblW w:type="auto" w:w="0"/>
-        <w:jc w:val="center"/>
-        <w:tblLook w:firstColumn="1" w:firstRow="1" w:lastColumn="0" w:lastRow="0" w:noHBand="0" w:noVBand="1" w:val="04A0"/>
-      </w:tblPr>
-      <w:tblGrid>
-        <w:gridCol w:w="9936"/>
-      </w:tblGrid>
-      <w:tr>
-        <w:tc>
-          <w:tcPr>
-            <w:tcW w:type="dxa" w:w="9792"/>
-            <w:shd w:fill="F3F4F6"/>
-            <w:tcBorders>
-              <w:top w:val="single" w:sz="4" w:space="0" w:color="CBD5E1"/>
-              <w:left w:val="single" w:sz="18" w:space="0" w:color="1679AB"/>
-              <w:bottom w:val="single" w:sz="4" w:space="0" w:color="CBD5E1"/>
-              <w:right w:val="single" w:sz="4" w:space="0" w:color="CBD5E1"/>
-            </w:tcBorders>
-          </w:tcPr>
-          <w:p>
-            <w:pPr>
-              <w:spacing w:before="80" w:after="80"/>
-              <w:ind w:left="144"/>
-            </w:pPr>
-            <w:r>
-              <w:rPr>
-                <w:rFonts w:ascii="Consolas" w:hAnsi="Consolas"/>
-                <w:b w:val="0"/>
-                <w:i w:val="0"/>
-                <w:color w:val="1E293B"/>
-                <w:sz w:val="19"/>
-              </w:rPr>
-              <w:t>sudo usermod -aG docker $USER</w:t>
-              <w:br/>
-              <w:t>newgrp docker</w:t>
-            </w:r>
-          </w:p>
-        </w:tc>
-      </w:tr>
-    </w:tbl>
-    <w:p>
-      <w:pPr>
-        <w:spacing w:after="80"/>
-      </w:pPr>
-    </w:p>
-    <w:p>
-      <w:pPr>
-        <w:spacing w:after="40"/>
-        <w:ind w:left="288"/>
-      </w:pPr>
-      <w:r>
-        <w:rPr>
-          <w:rFonts w:ascii="Calibri" w:hAnsi="Calibri"/>
-          <w:b/>
-          <w:i w:val="0"/>
-          <w:color w:val="282828"/>
-          <w:sz w:val="22"/>
-        </w:rPr>
-        <w:t>7. Verify Docker installation:</w:t>
-      </w:r>
-    </w:p>
-    <w:tbl>
-      <w:tblPr>
-        <w:tblW w:type="auto" w:w="0"/>
-        <w:jc w:val="center"/>
-        <w:tblLook w:firstColumn="1" w:firstRow="1" w:lastColumn="0" w:lastRow="0" w:noHBand="0" w:noVBand="1" w:val="04A0"/>
-      </w:tblPr>
-      <w:tblGrid>
-        <w:gridCol w:w="9936"/>
-      </w:tblGrid>
-      <w:tr>
-        <w:tc>
-          <w:tcPr>
-            <w:tcW w:type="dxa" w:w="9792"/>
-            <w:shd w:fill="F3F4F6"/>
-            <w:tcBorders>
-              <w:top w:val="single" w:sz="4" w:space="0" w:color="CBD5E1"/>
-              <w:left w:val="single" w:sz="18" w:space="0" w:color="1679AB"/>
-              <w:bottom w:val="single" w:sz="4" w:space="0" w:color="CBD5E1"/>
-              <w:right w:val="single" w:sz="4" w:space="0" w:color="CBD5E1"/>
-            </w:tcBorders>
-          </w:tcPr>
-          <w:p>
-            <w:pPr>
-              <w:spacing w:before="80" w:after="80"/>
-              <w:ind w:left="144"/>
-            </w:pPr>
-            <w:r>
-              <w:rPr>
-                <w:rFonts w:ascii="Consolas" w:hAnsi="Consolas"/>
-                <w:b w:val="0"/>
-                <w:i w:val="0"/>
-                <w:color w:val="1E293B"/>
-                <w:sz w:val="19"/>
-              </w:rPr>
-              <w:t>docker --version</w:t>
-              <w:br/>
-              <w:t># Output: Docker version 27.5.1, build 9f9e405</w:t>
-            </w:r>
-          </w:p>
-        </w:tc>
-      </w:tr>
-    </w:tbl>
-    <w:p>
-      <w:pPr>
-        <w:spacing w:after="80"/>
-      </w:pPr>
-    </w:p>
-    <w:p>
-      <w:pPr>
-        <w:spacing w:before="280" w:after="80"/>
-      </w:pPr>
-      <w:r>
-        <w:rPr>
-          <w:rFonts w:ascii="Calibri" w:hAnsi="Calibri"/>
-          <w:b/>
-          <w:i w:val="0"/>
-          <w:color w:val="0F3460"/>
-          <w:sz w:val="28"/>
-        </w:rPr>
-        <w:t>2. Create Docker Account, Pull, Tag, and Push Images (All 3 Containers)</w:t>
-      </w:r>
-    </w:p>
-    <w:p>
-      <w:r>
-        <w:rPr>
-          <w:rFonts w:ascii="Calibri" w:hAnsi="Calibri"/>
-          <w:b w:val="0"/>
-          <w:i w:val="0"/>
-          <w:color w:val="282828"/>
-          <w:sz w:val="22"/>
-        </w:rPr>
-        <w:t>This workflow is executed identically across Windows (PowerShell) and Linux (Terminal) to deliver all 3 project containers directly to Docker Hub.</w:t>
-      </w:r>
-    </w:p>
-    <w:p>
-      <w:pPr>
-        <w:spacing w:before="120"/>
-      </w:pPr>
-      <w:r>
-        <w:rPr>
-          <w:rFonts w:ascii="Calibri" w:hAnsi="Calibri"/>
-          <w:b/>
-          <w:i w:val="0"/>
-          <w:color w:val="1679AB"/>
-          <w:sz w:val="24"/>
-        </w:rPr>
-        <w:t>2.1 Create Docker Hub Account</w:t>
-      </w:r>
-    </w:p>
-    <w:p>
-      <w:pPr>
-        <w:spacing w:after="40"/>
-        <w:ind w:left="360"/>
-      </w:pPr>
-      <w:r>
-        <w:rPr>
-          <w:rFonts w:ascii="Calibri" w:hAnsi="Calibri"/>
-          <w:b/>
-          <w:i w:val="0"/>
-          <w:color w:val="282828"/>
-          <w:sz w:val="22"/>
-        </w:rPr>
-        <w:t xml:space="preserve">1. </w:t>
-      </w:r>
-      <w:r>
-        <w:rPr>
-          <w:rFonts w:ascii="Calibri" w:hAnsi="Calibri"/>
-          <w:b w:val="0"/>
-          <w:i w:val="0"/>
-          <w:color w:val="282828"/>
-          <w:sz w:val="22"/>
-        </w:rPr>
-        <w:t>Visit https://hub.docker.com and click 'Sign Up'.</w:t>
-      </w:r>
-    </w:p>
-    <w:p>
-      <w:pPr>
-        <w:spacing w:after="40"/>
-        <w:ind w:left="360"/>
-      </w:pPr>
-      <w:r>
-        <w:rPr>
-          <w:rFonts w:ascii="Calibri" w:hAnsi="Calibri"/>
-          <w:b/>
-          <w:i w:val="0"/>
-          <w:color w:val="282828"/>
-          <w:sz w:val="22"/>
-        </w:rPr>
-        <w:t xml:space="preserve">2. </w:t>
-      </w:r>
-      <w:r>
-        <w:rPr>
-          <w:rFonts w:ascii="Calibri" w:hAnsi="Calibri"/>
-          <w:b w:val="0"/>
-          <w:i w:val="0"/>
-          <w:color w:val="282828"/>
-          <w:sz w:val="22"/>
-        </w:rPr>
-        <w:t>Fill in account credentials: Username (lorndavid), Email address, and secure Password.</w:t>
-      </w:r>
-    </w:p>
-    <w:p>
-      <w:pPr>
-        <w:spacing w:after="40"/>
-        <w:ind w:left="360"/>
-      </w:pPr>
-      <w:r>
-        <w:rPr>
-          <w:rFonts w:ascii="Calibri" w:hAnsi="Calibri"/>
-          <w:b/>
-          <w:i w:val="0"/>
-          <w:color w:val="282828"/>
-          <w:sz w:val="22"/>
-        </w:rPr>
-        <w:t xml:space="preserve">3. </w:t>
-      </w:r>
-      <w:r>
-        <w:rPr>
-          <w:rFonts w:ascii="Calibri" w:hAnsi="Calibri"/>
-          <w:b w:val="0"/>
-          <w:i w:val="0"/>
-          <w:color w:val="282828"/>
-          <w:sz w:val="22"/>
-        </w:rPr>
-        <w:t>Check your email inbox and click the verification link to confirm and activate your Docker Hub account.</w:t>
-      </w:r>
-    </w:p>
-    <w:p>
-      <w:pPr>
-        <w:spacing w:before="120"/>
-      </w:pPr>
-      <w:r>
-        <w:rPr>
-          <w:rFonts w:ascii="Calibri" w:hAnsi="Calibri"/>
-          <w:b/>
-          <w:i w:val="0"/>
-          <w:color w:val="1679AB"/>
-          <w:sz w:val="24"/>
-        </w:rPr>
-        <w:t>2.2 Login to Docker Hub via Terminal</w:t>
-      </w:r>
-    </w:p>
-    <w:p>
-      <w:r>
-        <w:rPr>
-          <w:rFonts w:ascii="Calibri" w:hAnsi="Calibri"/>
-          <w:b w:val="0"/>
-          <w:i w:val="0"/>
-          <w:color w:val="282828"/>
-          <w:sz w:val="22"/>
-        </w:rPr>
-        <w:t>Execute the login command and enter your Docker Hub username and password/access token:</w:t>
-      </w:r>
-    </w:p>
-    <w:tbl>
-      <w:tblPr>
-        <w:tblW w:type="auto" w:w="0"/>
-        <w:jc w:val="center"/>
-        <w:tblLook w:firstColumn="1" w:firstRow="1" w:lastColumn="0" w:lastRow="0" w:noHBand="0" w:noVBand="1" w:val="04A0"/>
-      </w:tblPr>
-      <w:tblGrid>
-        <w:gridCol w:w="9936"/>
-      </w:tblGrid>
-      <w:tr>
-        <w:tc>
-          <w:tcPr>
-            <w:tcW w:type="dxa" w:w="9792"/>
-            <w:shd w:fill="F3F4F6"/>
-            <w:tcBorders>
-              <w:top w:val="single" w:sz="4" w:space="0" w:color="CBD5E1"/>
-              <w:left w:val="single" w:sz="18" w:space="0" w:color="1679AB"/>
+              <w:left w:val="single" w:sz="16" w:space="0" w:color="1679AB"/>
               <w:bottom w:val="single" w:sz="4" w:space="0" w:color="CBD5E1"/>
               <w:right w:val="single" w:sz="4" w:space="0" w:color="CBD5E1"/>
             </w:tcBorders>
@@ -1088,54 +556,19 @@
     </w:tbl>
     <w:p>
       <w:pPr>
-        <w:spacing w:after="80"/>
+        <w:spacing w:after="40"/>
       </w:pPr>
     </w:p>
     <w:p>
-      <w:pPr>
-        <w:spacing w:before="120"/>
-      </w:pPr>
       <w:r>
         <w:rPr>
           <w:rFonts w:ascii="Calibri" w:hAnsi="Calibri"/>
           <w:b/>
           <w:i w:val="0"/>
           <w:color w:val="1679AB"/>
-          <w:sz w:val="24"/>
-        </w:rPr>
-        <w:t>2.3 Build, Tag, and Push All 3 Containers to Docker Hub</w:t>
-      </w:r>
-    </w:p>
-    <w:p>
-      <w:r>
-        <w:rPr>
-          <w:rFonts w:ascii="Calibri" w:hAnsi="Calibri"/>
-          <w:b w:val="0"/>
-          <w:i w:val="0"/>
-          <w:color w:val="282828"/>
           <w:sz w:val="22"/>
         </w:rPr>
-        <w:t xml:space="preserve">To satisfy the homework requirement of 3 distinct containers, all 3 images were tagged and published under the personal account </w:t>
-      </w:r>
-      <w:r>
-        <w:rPr>
-          <w:rFonts w:ascii="Calibri" w:hAnsi="Calibri"/>
-          <w:b/>
-          <w:i w:val="0"/>
-          <w:color w:val="0F3460"/>
-          <w:sz w:val="22"/>
-        </w:rPr>
-        <w:t>lorndavid</w:t>
-      </w:r>
-      <w:r>
-        <w:rPr>
-          <w:rFonts w:ascii="Calibri" w:hAnsi="Calibri"/>
-          <w:b w:val="0"/>
-          <w:i w:val="0"/>
-          <w:color w:val="282828"/>
-          <w:sz w:val="22"/>
-        </w:rPr>
-        <w:t>:</w:t>
+        <w:t>2.3 Tag and Push All 3 Containers to Docker Hub:</w:t>
       </w:r>
     </w:p>
     <w:tbl>
@@ -1151,10 +584,10 @@
         <w:tc>
           <w:tcPr>
             <w:tcW w:type="dxa" w:w="9792"/>
-            <w:shd w:fill="F3F4F6"/>
+            <w:shd w:fill="F1F5F9"/>
             <w:tcBorders>
               <w:top w:val="single" w:sz="4" w:space="0" w:color="CBD5E1"/>
-              <w:left w:val="single" w:sz="18" w:space="0" w:color="1679AB"/>
+              <w:left w:val="single" w:sz="16" w:space="0" w:color="1679AB"/>
               <w:bottom w:val="single" w:sz="4" w:space="0" w:color="CBD5E1"/>
               <w:right w:val="single" w:sz="4" w:space="0" w:color="CBD5E1"/>
             </w:tcBorders>
@@ -1172,35 +605,27 @@
                 <w:color w:val="1E293B"/>
                 <w:sz w:val="19"/>
               </w:rPr>
-              <w:t># --- 1. Database Image (PostgreSQL 16) ---</w:t>
+              <w:t># 1. Database Image (PostgreSQL 16)</w:t>
               <w:br/>
               <w:t>docker pull postgres:16-alpine</w:t>
               <w:br/>
               <w:t>docker tag postgres:16-alpine lorndavid/khmerapi-database:latest</w:t>
               <w:br/>
-              <w:t>docker tag postgres:16-alpine lorndavid/khmerapi-database:1.0.0</w:t>
-              <w:br/>
               <w:t>docker push lorndavid/khmerapi-database:latest</w:t>
               <w:br/>
-              <w:t>docker push lorndavid/khmerapi-database:1.0.0</w:t>
               <w:br/>
+              <w:t># 2. Backend REST API Image (Node.js Express)</w:t>
               <w:br/>
-              <w:t># --- 2. Backend REST API Image (Node.js Express) ---</w:t>
-              <w:br/>
-              <w:t>docker build -t lorndavid/khmerapi-backend:latest -t lorndavid/khmerapi-backend:1.0.0 -f Dockerfile.backend .</w:t>
+              <w:t>docker build -t lorndavid/khmerapi-backend:latest -f Dockerfile.backend .</w:t>
               <w:br/>
               <w:t>docker push lorndavid/khmerapi-backend:latest</w:t>
               <w:br/>
-              <w:t>docker push lorndavid/khmerapi-backend:1.0.0</w:t>
               <w:br/>
+              <w:t># 3. Frontend Web Image (Vue 3 + Nginx)</w:t>
               <w:br/>
-              <w:t># --- 3. Frontend Web Application Image (Vue 3 + Nginx) ---</w:t>
-              <w:br/>
-              <w:t>docker build -t lorndavid/khmerapi-frontend:latest -t lorndavid/khmerapi-frontend:1.0.0 -f frontend/Dockerfile frontend</w:t>
+              <w:t>docker build -t lorndavid/khmerapi-frontend:latest -f frontend/Dockerfile frontend</w:t>
               <w:br/>
               <w:t>docker push lorndavid/khmerapi-frontend:latest</w:t>
-              <w:br/>
-              <w:t>docker push lorndavid/khmerapi-frontend:1.0.0</w:t>
             </w:r>
           </w:p>
         </w:tc>
@@ -1208,363 +633,33 @@
     </w:tbl>
     <w:p>
       <w:pPr>
-        <w:spacing w:after="80"/>
+        <w:spacing w:after="40"/>
       </w:pPr>
     </w:p>
     <w:p>
-      <w:pPr>
-        <w:spacing w:after="40"/>
-      </w:pPr>
       <w:r>
         <w:rPr>
           <w:rFonts w:ascii="Calibri" w:hAnsi="Calibri"/>
           <w:b/>
           <w:i w:val="0"/>
-          <w:color w:val="282828"/>
+          <w:color w:val="1E293B"/>
           <w:sz w:val="22"/>
         </w:rPr>
-        <w:t>• Verification on Docker Hub:</w:t>
+        <w:t xml:space="preserve">• Verify on Docker Hub: </w:t>
       </w:r>
+      <w:hyperlink r:id="rId11" w:history="1">
+        <w:r>
+          <w:rPr>
+            <w:color w:val="1679AB"/>
+            <w:u w:val="single"/>
+          </w:rPr>
+          <w:t>https://hub.docker.com/u/lorndavid</w:t>
+        </w:r>
+      </w:hyperlink>
     </w:p>
     <w:p>
       <w:pPr>
-        <w:ind w:left="288"/>
-      </w:pPr>
-      <w:r>
-        <w:rPr>
-          <w:rFonts w:ascii="Calibri" w:hAnsi="Calibri"/>
-          <w:b w:val="0"/>
-          <w:i w:val="0"/>
-          <w:color w:val="282828"/>
-          <w:sz w:val="22"/>
-        </w:rPr>
-        <w:t>Navigating to https://hub.docker.com/u/lorndavid confirms all 3 active public repositories:</w:t>
-      </w:r>
-    </w:p>
-    <w:tbl>
-      <w:tblPr>
-        <w:tblW w:type="auto" w:w="0"/>
-        <w:jc w:val="center"/>
-        <w:tblLook w:firstColumn="1" w:firstRow="1" w:lastColumn="0" w:lastRow="0" w:noHBand="0" w:noVBand="1" w:val="04A0"/>
-      </w:tblPr>
-      <w:tblGrid>
-        <w:gridCol w:w="2484"/>
-        <w:gridCol w:w="2484"/>
-        <w:gridCol w:w="2484"/>
-        <w:gridCol w:w="2484"/>
-      </w:tblGrid>
-      <w:tr>
-        <w:tc>
-          <w:tcPr>
-            <w:tcW w:type="dxa" w:w="2484"/>
-            <w:shd w:fill="1E293B"/>
-          </w:tcPr>
-          <w:p>
-            <w:pPr>
-              <w:jc w:val="center"/>
-            </w:pPr>
-            <w:r>
-              <w:rPr>
-                <w:rFonts w:ascii="Calibri" w:hAnsi="Calibri"/>
-                <w:b/>
-                <w:i w:val="0"/>
-                <w:color w:val="FFFFFF"/>
-                <w:sz w:val="19"/>
-              </w:rPr>
-              <w:t>Container</w:t>
-            </w:r>
-          </w:p>
-        </w:tc>
-        <w:tc>
-          <w:tcPr>
-            <w:tcW w:type="dxa" w:w="2484"/>
-            <w:shd w:fill="1E293B"/>
-          </w:tcPr>
-          <w:p>
-            <w:pPr>
-              <w:jc w:val="center"/>
-            </w:pPr>
-            <w:r>
-              <w:rPr>
-                <w:rFonts w:ascii="Calibri" w:hAnsi="Calibri"/>
-                <w:b/>
-                <w:i w:val="0"/>
-                <w:color w:val="FFFFFF"/>
-                <w:sz w:val="19"/>
-              </w:rPr>
-              <w:t>Repository / Image Name</w:t>
-            </w:r>
-          </w:p>
-        </w:tc>
-        <w:tc>
-          <w:tcPr>
-            <w:tcW w:type="dxa" w:w="2484"/>
-            <w:shd w:fill="1E293B"/>
-          </w:tcPr>
-          <w:p>
-            <w:pPr>
-              <w:jc w:val="center"/>
-            </w:pPr>
-            <w:r>
-              <w:rPr>
-                <w:rFonts w:ascii="Calibri" w:hAnsi="Calibri"/>
-                <w:b/>
-                <w:i w:val="0"/>
-                <w:color w:val="FFFFFF"/>
-                <w:sz w:val="19"/>
-              </w:rPr>
-              <w:t>Tags Available</w:t>
-            </w:r>
-          </w:p>
-        </w:tc>
-        <w:tc>
-          <w:tcPr>
-            <w:tcW w:type="dxa" w:w="2484"/>
-            <w:shd w:fill="1E293B"/>
-          </w:tcPr>
-          <w:p>
-            <w:pPr>
-              <w:jc w:val="center"/>
-            </w:pPr>
-            <w:r>
-              <w:rPr>
-                <w:rFonts w:ascii="Calibri" w:hAnsi="Calibri"/>
-                <w:b/>
-                <w:i w:val="0"/>
-                <w:color w:val="FFFFFF"/>
-                <w:sz w:val="19"/>
-              </w:rPr>
-              <w:t>Status</w:t>
-            </w:r>
-          </w:p>
-        </w:tc>
-      </w:tr>
-      <w:tr>
-        <w:tc>
-          <w:tcPr>
-            <w:tcW w:type="dxa" w:w="2484"/>
-            <w:shd w:fill="F8FAFC"/>
-          </w:tcPr>
-          <w:p>
-            <w:r>
-              <w:rPr>
-                <w:rFonts w:ascii="Calibri" w:hAnsi="Calibri"/>
-                <w:b/>
-                <w:i w:val="0"/>
-                <w:color w:val="282828"/>
-                <w:sz w:val="19"/>
-              </w:rPr>
-              <w:t>1. Database</w:t>
-            </w:r>
-          </w:p>
-        </w:tc>
-        <w:tc>
-          <w:tcPr>
-            <w:tcW w:type="dxa" w:w="2484"/>
-            <w:shd w:fill="F8FAFC"/>
-          </w:tcPr>
-          <w:p>
-            <w:r>
-              <w:rPr>
-                <w:rFonts w:ascii="Calibri" w:hAnsi="Calibri"/>
-                <w:b/>
-                <w:i w:val="0"/>
-                <w:color w:val="282828"/>
-                <w:sz w:val="19"/>
-              </w:rPr>
-              <w:t>lorndavid/khmerapi-database</w:t>
-            </w:r>
-          </w:p>
-        </w:tc>
-        <w:tc>
-          <w:tcPr>
-            <w:tcW w:type="dxa" w:w="2484"/>
-            <w:shd w:fill="F8FAFC"/>
-          </w:tcPr>
-          <w:p>
-            <w:r>
-              <w:rPr>
-                <w:rFonts w:ascii="Calibri" w:hAnsi="Calibri"/>
-                <w:b w:val="0"/>
-                <w:i w:val="0"/>
-                <w:color w:val="282828"/>
-                <w:sz w:val="19"/>
-              </w:rPr>
-              <w:t>latest, 1.0.0</w:t>
-            </w:r>
-          </w:p>
-        </w:tc>
-        <w:tc>
-          <w:tcPr>
-            <w:tcW w:type="dxa" w:w="2484"/>
-            <w:shd w:fill="F8FAFC"/>
-          </w:tcPr>
-          <w:p>
-            <w:r>
-              <w:rPr>
-                <w:rFonts w:ascii="Calibri" w:hAnsi="Calibri"/>
-                <w:b w:val="0"/>
-                <w:i w:val="0"/>
-                <w:color w:val="282828"/>
-                <w:sz w:val="19"/>
-              </w:rPr>
-              <w:t>Active on Docker Hub</w:t>
-            </w:r>
-          </w:p>
-        </w:tc>
-      </w:tr>
-      <w:tr>
-        <w:tc>
-          <w:tcPr>
-            <w:tcW w:type="dxa" w:w="2484"/>
-            <w:shd w:fill="FFFFFF"/>
-          </w:tcPr>
-          <w:p>
-            <w:r>
-              <w:rPr>
-                <w:rFonts w:ascii="Calibri" w:hAnsi="Calibri"/>
-                <w:b/>
-                <w:i w:val="0"/>
-                <w:color w:val="282828"/>
-                <w:sz w:val="19"/>
-              </w:rPr>
-              <w:t>2. Backend API</w:t>
-            </w:r>
-          </w:p>
-        </w:tc>
-        <w:tc>
-          <w:tcPr>
-            <w:tcW w:type="dxa" w:w="2484"/>
-            <w:shd w:fill="FFFFFF"/>
-          </w:tcPr>
-          <w:p>
-            <w:r>
-              <w:rPr>
-                <w:rFonts w:ascii="Calibri" w:hAnsi="Calibri"/>
-                <w:b/>
-                <w:i w:val="0"/>
-                <w:color w:val="282828"/>
-                <w:sz w:val="19"/>
-              </w:rPr>
-              <w:t>lorndavid/khmerapi-backend</w:t>
-            </w:r>
-          </w:p>
-        </w:tc>
-        <w:tc>
-          <w:tcPr>
-            <w:tcW w:type="dxa" w:w="2484"/>
-            <w:shd w:fill="FFFFFF"/>
-          </w:tcPr>
-          <w:p>
-            <w:r>
-              <w:rPr>
-                <w:rFonts w:ascii="Calibri" w:hAnsi="Calibri"/>
-                <w:b w:val="0"/>
-                <w:i w:val="0"/>
-                <w:color w:val="282828"/>
-                <w:sz w:val="19"/>
-              </w:rPr>
-              <w:t>latest, 1.0.0</w:t>
-            </w:r>
-          </w:p>
-        </w:tc>
-        <w:tc>
-          <w:tcPr>
-            <w:tcW w:type="dxa" w:w="2484"/>
-            <w:shd w:fill="FFFFFF"/>
-          </w:tcPr>
-          <w:p>
-            <w:r>
-              <w:rPr>
-                <w:rFonts w:ascii="Calibri" w:hAnsi="Calibri"/>
-                <w:b w:val="0"/>
-                <w:i w:val="0"/>
-                <w:color w:val="282828"/>
-                <w:sz w:val="19"/>
-              </w:rPr>
-              <w:t>Active on Docker Hub</w:t>
-            </w:r>
-          </w:p>
-        </w:tc>
-      </w:tr>
-      <w:tr>
-        <w:tc>
-          <w:tcPr>
-            <w:tcW w:type="dxa" w:w="2484"/>
-            <w:shd w:fill="F8FAFC"/>
-          </w:tcPr>
-          <w:p>
-            <w:r>
-              <w:rPr>
-                <w:rFonts w:ascii="Calibri" w:hAnsi="Calibri"/>
-                <w:b/>
-                <w:i w:val="0"/>
-                <w:color w:val="282828"/>
-                <w:sz w:val="19"/>
-              </w:rPr>
-              <w:t>3. Frontend Web</w:t>
-            </w:r>
-          </w:p>
-        </w:tc>
-        <w:tc>
-          <w:tcPr>
-            <w:tcW w:type="dxa" w:w="2484"/>
-            <w:shd w:fill="F8FAFC"/>
-          </w:tcPr>
-          <w:p>
-            <w:r>
-              <w:rPr>
-                <w:rFonts w:ascii="Calibri" w:hAnsi="Calibri"/>
-                <w:b/>
-                <w:i w:val="0"/>
-                <w:color w:val="282828"/>
-                <w:sz w:val="19"/>
-              </w:rPr>
-              <w:t>lorndavid/khmerapi-frontend</w:t>
-            </w:r>
-          </w:p>
-        </w:tc>
-        <w:tc>
-          <w:tcPr>
-            <w:tcW w:type="dxa" w:w="2484"/>
-            <w:shd w:fill="F8FAFC"/>
-          </w:tcPr>
-          <w:p>
-            <w:r>
-              <w:rPr>
-                <w:rFonts w:ascii="Calibri" w:hAnsi="Calibri"/>
-                <w:b w:val="0"/>
-                <w:i w:val="0"/>
-                <w:color w:val="282828"/>
-                <w:sz w:val="19"/>
-              </w:rPr>
-              <w:t>latest, 1.0.0</w:t>
-            </w:r>
-          </w:p>
-        </w:tc>
-        <w:tc>
-          <w:tcPr>
-            <w:tcW w:type="dxa" w:w="2484"/>
-            <w:shd w:fill="F8FAFC"/>
-          </w:tcPr>
-          <w:p>
-            <w:r>
-              <w:rPr>
-                <w:rFonts w:ascii="Calibri" w:hAnsi="Calibri"/>
-                <w:b w:val="0"/>
-                <w:i w:val="0"/>
-                <w:color w:val="282828"/>
-                <w:sz w:val="19"/>
-              </w:rPr>
-              <w:t>Active on Docker Hub</w:t>
-            </w:r>
-          </w:p>
-        </w:tc>
-      </w:tr>
-    </w:tbl>
-    <w:p>
-      <w:pPr>
-        <w:spacing w:before="160" w:after="40"/>
+        <w:spacing w:before="80" w:after="40"/>
         <w:jc w:val="center"/>
       </w:pPr>
     </w:p>
@@ -1572,7 +667,7 @@
       <w:r>
         <w:drawing>
           <wp:inline xmlns:a="http://schemas.openxmlformats.org/drawingml/2006/main" xmlns:pic="http://schemas.openxmlformats.org/drawingml/2006/picture">
-            <wp:extent cx="5943600" cy="1323380"/>
+            <wp:extent cx="5669280" cy="1262301"/>
             <wp:docPr id="1" name="Picture 1"/>
             <wp:cNvGraphicFramePr>
               <a:graphicFrameLocks noChangeAspect="1"/>
@@ -1585,7 +680,7 @@
                     <pic:cNvPicPr/>
                   </pic:nvPicPr>
                   <pic:blipFill>
-                    <a:blip r:embed="rId9"/>
+                    <a:blip r:embed="rId12"/>
                     <a:stretch>
                       <a:fillRect/>
                     </a:stretch>
@@ -1593,7 +688,7 @@
                   <pic:spPr>
                     <a:xfrm>
                       <a:off x="0" y="0"/>
-                      <a:ext cx="5943600" cy="1323380"/>
+                      <a:ext cx="5669280" cy="1262301"/>
                     </a:xfrm>
                     <a:prstGeom prst="rect"/>
                   </pic:spPr>
@@ -1616,17 +711,12 @@
           <w:color w:val="64748B"/>
           <w:sz w:val="18"/>
         </w:rPr>
-        <w:t>Figure 2.1: Published Container Repositories on Docker Hub (account: lorndavid)</w:t>
+        <w:t>Verified Images on Docker Hub: lorndavid/khmerapi-database, khmerapi-backend, khmerapi-frontend</w:t>
       </w:r>
     </w:p>
     <w:p>
       <w:pPr>
-        <w:spacing w:after="160"/>
-      </w:pPr>
-    </w:p>
-    <w:p>
-      <w:pPr>
-        <w:spacing w:before="280" w:after="80"/>
+        <w:spacing w:before="160" w:after="40"/>
       </w:pPr>
       <w:r>
         <w:rPr>
@@ -1634,9 +724,9 @@
           <w:b/>
           <w:i w:val="0"/>
           <w:color w:val="0F3460"/>
-          <w:sz w:val="28"/>
+          <w:sz w:val="26"/>
         </w:rPr>
-        <w:t>3. The 3 Docker Containers Architecture &amp; Docker Desktop Setup</w:t>
+        <w:t>3. The 3 Containers Setup for Docker Desktop (Teacher Run)</w:t>
       </w:r>
     </w:p>
     <w:p>
@@ -1645,103 +735,30 @@
           <w:rFonts w:ascii="Calibri" w:hAnsi="Calibri"/>
           <w:b w:val="0"/>
           <w:i w:val="0"/>
-          <w:color w:val="282828"/>
+          <w:color w:val="1E293B"/>
           <w:sz w:val="22"/>
         </w:rPr>
-        <w:t>The complete system is orchestrated using Docker Compose. The teacher can evaluate and run all 3 containers on Docker Desktop with zero local code compilation or dependencies.</w:t>
+        <w:t xml:space="preserve">The teacher can run all 3 containers on Docker Desktop using this single </w:t>
       </w:r>
-    </w:p>
-    <w:p>
-      <w:pPr>
-        <w:spacing w:after="40"/>
-        <w:ind w:left="288"/>
-      </w:pPr>
       <w:r>
         <w:rPr>
           <w:rFonts w:ascii="Calibri" w:hAnsi="Calibri"/>
           <w:b/>
           <w:i w:val="0"/>
-          <w:color w:val="1679AB"/>
+          <w:color w:val="1E293B"/>
           <w:sz w:val="22"/>
         </w:rPr>
-        <w:t xml:space="preserve">• 1.1 Database Container (khmerapi-database): </w:t>
+        <w:t>docker-compose.yml</w:t>
       </w:r>
       <w:r>
         <w:rPr>
           <w:rFonts w:ascii="Calibri" w:hAnsi="Calibri"/>
           <w:b w:val="0"/>
           <w:i w:val="0"/>
-          <w:color w:val="282828"/>
+          <w:color w:val="1E293B"/>
           <w:sz w:val="22"/>
         </w:rPr>
-        <w:t>Runs PostgreSQL 16 on Alpine Linux. Listens on internal port 5432. Automatically maps persistent storage volume 'khmerapi_db_data' and includes pg_isready health checks.</w:t>
-      </w:r>
-    </w:p>
-    <w:p>
-      <w:pPr>
-        <w:spacing w:after="40"/>
-        <w:ind w:left="288"/>
-      </w:pPr>
-      <w:r>
-        <w:rPr>
-          <w:rFonts w:ascii="Calibri" w:hAnsi="Calibri"/>
-          <w:b/>
-          <w:i w:val="0"/>
-          <w:color w:val="1679AB"/>
-          <w:sz w:val="22"/>
-        </w:rPr>
-        <w:t xml:space="preserve">• 1.2 Backend Container (khmerapi-backend): </w:t>
-      </w:r>
-      <w:r>
-        <w:rPr>
-          <w:rFonts w:ascii="Calibri" w:hAnsi="Calibri"/>
-          <w:b w:val="0"/>
-          <w:i w:val="0"/>
-          <w:color w:val="282828"/>
-          <w:sz w:val="22"/>
-        </w:rPr>
-        <w:t>Node.js Express REST API server built with Prisma ORM. On startup, it synchronizes database schemas and imports complete Cambodian geographic data (25 provinces, 210 districts, 1,661 communes, 14,528 villages) automatically.</w:t>
-      </w:r>
-    </w:p>
-    <w:p>
-      <w:pPr>
-        <w:spacing w:after="40"/>
-        <w:ind w:left="288"/>
-      </w:pPr>
-      <w:r>
-        <w:rPr>
-          <w:rFonts w:ascii="Calibri" w:hAnsi="Calibri"/>
-          <w:b/>
-          <w:i w:val="0"/>
-          <w:color w:val="1679AB"/>
-          <w:sz w:val="22"/>
-        </w:rPr>
-        <w:t xml:space="preserve">• 1.3 Frontend Container (khmerapi-frontend): </w:t>
-      </w:r>
-      <w:r>
-        <w:rPr>
-          <w:rFonts w:ascii="Calibri" w:hAnsi="Calibri"/>
-          <w:b w:val="0"/>
-          <w:i w:val="0"/>
-          <w:color w:val="282828"/>
-          <w:sz w:val="22"/>
-        </w:rPr>
-        <w:t>Vue 3 single-page application served via an internal Nginx web server on port 80. Nginx proxies all '/v1/' requests directly to the backend container, eliminating cross-origin (CORS) issues.</w:t>
-      </w:r>
-    </w:p>
-    <w:p>
-      <w:pPr>
-        <w:spacing w:before="120" w:after="40"/>
-      </w:pPr>
-      <w:r>
-        <w:rPr>
-          <w:rFonts w:ascii="Calibri" w:hAnsi="Calibri"/>
-          <w:b/>
-          <w:i w:val="0"/>
-          <w:color w:val="282828"/>
-          <w:sz w:val="22"/>
-        </w:rPr>
-        <w:t>• Complete Turnkey docker-compose.yml Configuration:</w:t>
+        <w:t xml:space="preserve"> file:</w:t>
       </w:r>
     </w:p>
     <w:tbl>
@@ -1757,10 +774,10 @@
         <w:tc>
           <w:tcPr>
             <w:tcW w:type="dxa" w:w="9792"/>
-            <w:shd w:fill="F3F4F6"/>
+            <w:shd w:fill="F1F5F9"/>
             <w:tcBorders>
               <w:top w:val="single" w:sz="4" w:space="0" w:color="CBD5E1"/>
-              <w:left w:val="single" w:sz="18" w:space="0" w:color="1679AB"/>
+              <w:left w:val="single" w:sz="16" w:space="0" w:color="1679AB"/>
               <w:bottom w:val="single" w:sz="4" w:space="0" w:color="CBD5E1"/>
               <w:right w:val="single" w:sz="4" w:space="0" w:color="CBD5E1"/>
             </w:tcBorders>
@@ -1820,7 +837,7 @@
               <w:t xml:space="preserve">      retries: 5</w:t>
               <w:br/>
               <w:br/>
-              <w:t xml:space="preserve">  # 2. Backend REST API Container</w:t>
+              <w:t xml:space="preserve">  # 2. Backend Container (Node.js Express API)</w:t>
               <w:br/>
               <w:t xml:space="preserve">  backend:</w:t>
               <w:br/>
@@ -1855,7 +872,7 @@
               <w:t xml:space="preserve">        condition: service_healthy</w:t>
               <w:br/>
               <w:br/>
-              <w:t xml:space="preserve">  # 3. Frontend Web Application Container</w:t>
+              <w:t xml:space="preserve">  # 3. Frontend Container (Vue 3 + Nginx Reverse Proxy)</w:t>
               <w:br/>
               <w:t xml:space="preserve">  frontend:</w:t>
               <w:br/>
@@ -1884,22 +901,19 @@
     </w:tbl>
     <w:p>
       <w:pPr>
-        <w:spacing w:after="80"/>
+        <w:spacing w:after="40"/>
       </w:pPr>
     </w:p>
     <w:p>
-      <w:pPr>
-        <w:spacing w:after="40"/>
-      </w:pPr>
       <w:r>
         <w:rPr>
           <w:rFonts w:ascii="Calibri" w:hAnsi="Calibri"/>
           <w:b/>
           <w:i w:val="0"/>
-          <w:color w:val="282828"/>
+          <w:color w:val="1E293B"/>
           <w:sz w:val="22"/>
         </w:rPr>
-        <w:t>• How to Run and Test on Docker Desktop:</w:t>
+        <w:t>• Step to run in terminal:</w:t>
       </w:r>
     </w:p>
     <w:tbl>
@@ -1915,10 +929,10 @@
         <w:tc>
           <w:tcPr>
             <w:tcW w:type="dxa" w:w="9792"/>
-            <w:shd w:fill="F3F4F6"/>
+            <w:shd w:fill="F1F5F9"/>
             <w:tcBorders>
               <w:top w:val="single" w:sz="4" w:space="0" w:color="CBD5E1"/>
-              <w:left w:val="single" w:sz="18" w:space="0" w:color="1679AB"/>
+              <w:left w:val="single" w:sz="16" w:space="0" w:color="1679AB"/>
               <w:bottom w:val="single" w:sz="4" w:space="0" w:color="CBD5E1"/>
               <w:right w:val="single" w:sz="4" w:space="0" w:color="CBD5E1"/>
             </w:tcBorders>
@@ -1936,28 +950,13 @@
                 <w:color w:val="1E293B"/>
                 <w:sz w:val="19"/>
               </w:rPr>
-              <w:t># 1. Start all 3 containers with a single command</w:t>
+              <w:t>&gt; docker compose up -d</w:t>
               <w:br/>
-              <w:t>docker compose up -d</w:t>
+              <w:t>✔ Container khmerapi-database  Healthy</w:t>
               <w:br/>
+              <w:t>✔ Container khmerapi-backend   Started</w:t>
               <w:br/>
-              <w:t># 2. Verify all 3 containers are healthy and running</w:t>
-              <w:br/>
-              <w:t>docker ps</w:t>
-              <w:br/>
-              <w:br/>
-              <w:t># 3. Test in Browser:</w:t>
-              <w:br/>
-              <w:t># Frontend Web App:  http://localhost</w:t>
-              <w:br/>
-              <w:t># REST API Endpoint: http://localhost/v1/provinces</w:t>
-              <w:br/>
-              <w:t># Health Status:     http://localhost:4000/health</w:t>
-              <w:br/>
-              <w:br/>
-              <w:t># 4. Stop containers when finished:</w:t>
-              <w:br/>
-              <w:t>docker compose down</w:t>
+              <w:t>✔ Container khmerapi-frontend  Started</w:t>
             </w:r>
           </w:p>
         </w:tc>
@@ -1965,12 +964,62 @@
     </w:tbl>
     <w:p>
       <w:pPr>
-        <w:spacing w:after="80"/>
+        <w:spacing w:after="40"/>
       </w:pPr>
     </w:p>
     <w:p>
+      <w:r>
+        <w:rPr>
+          <w:rFonts w:ascii="Calibri" w:hAnsi="Calibri"/>
+          <w:b/>
+          <w:i w:val="0"/>
+          <w:color w:val="1E293B"/>
+          <w:sz w:val="22"/>
+        </w:rPr>
+        <w:t xml:space="preserve">• Local Browser Testing: </w:t>
+      </w:r>
+      <w:hyperlink r:id="rId13" w:history="1">
+        <w:r>
+          <w:rPr>
+            <w:color w:val="1679AB"/>
+            <w:u w:val="single"/>
+          </w:rPr>
+          <w:t>http://localhost</w:t>
+        </w:r>
+      </w:hyperlink>
+      <w:r>
+        <w:rPr>
+          <w:rFonts w:ascii="Calibri" w:hAnsi="Calibri"/>
+          <w:b w:val="0"/>
+          <w:i w:val="0"/>
+          <w:color w:val="1E293B"/>
+          <w:sz w:val="22"/>
+        </w:rPr>
+        <w:t xml:space="preserve"> (Frontend) | </w:t>
+      </w:r>
+      <w:hyperlink r:id="rId14" w:history="1">
+        <w:r>
+          <w:rPr>
+            <w:color w:val="1679AB"/>
+            <w:u w:val="single"/>
+          </w:rPr>
+          <w:t>http://localhost/v1/provinces</w:t>
+        </w:r>
+      </w:hyperlink>
+      <w:r>
+        <w:rPr>
+          <w:rFonts w:ascii="Calibri" w:hAnsi="Calibri"/>
+          <w:b w:val="0"/>
+          <w:i w:val="0"/>
+          <w:color w:val="1E293B"/>
+          <w:sz w:val="22"/>
+        </w:rPr>
+        <w:t xml:space="preserve"> (API)</w:t>
+      </w:r>
+    </w:p>
+    <w:p>
       <w:pPr>
-        <w:spacing w:before="280" w:after="80"/>
+        <w:spacing w:before="160" w:after="40"/>
       </w:pPr>
       <w:r>
         <w:rPr>
@@ -1978,333 +1027,173 @@
           <w:b/>
           <w:i w:val="0"/>
           <w:color w:val="0F3460"/>
-          <w:sz w:val="28"/>
+          <w:sz w:val="26"/>
         </w:rPr>
-        <w:t>4. Production Deployment on Free VPS &amp; Free Domain with Nginx Proxy Manager</w:t>
+        <w:t>4. Cloud Hosting on Free VPS &amp; Free Domain (3 Containers)</w:t>
       </w:r>
     </w:p>
     <w:p>
       <w:r>
         <w:rPr>
           <w:rFonts w:ascii="Calibri" w:hAnsi="Calibri"/>
+          <w:b/>
+          <w:i w:val="0"/>
+          <w:color w:val="1E293B"/>
+          <w:sz w:val="22"/>
+        </w:rPr>
+        <w:t xml:space="preserve">• Cloud VPS: </w:t>
+      </w:r>
+      <w:r>
+        <w:rPr>
+          <w:rFonts w:ascii="Calibri" w:hAnsi="Calibri"/>
           <w:b w:val="0"/>
           <w:i w:val="0"/>
-          <w:color w:val="282828"/>
+          <w:color w:val="1E293B"/>
           <w:sz w:val="22"/>
         </w:rPr>
-        <w:t>In addition to local Docker Desktop execution, the project is deployed to a live Cloud VPS environment with automated HTTPS SSL and reverse proxy management.</w:t>
+        <w:t>Ubuntu 24.04 LTS Server (IP: 147.93.111.196)</w:t>
+        <w:br/>
+      </w:r>
+      <w:r>
+        <w:rPr>
+          <w:rFonts w:ascii="Calibri" w:hAnsi="Calibri"/>
+          <w:b/>
+          <w:i w:val="0"/>
+          <w:color w:val="1E293B"/>
+          <w:sz w:val="22"/>
+        </w:rPr>
+        <w:t xml:space="preserve">• Architecture: </w:t>
+      </w:r>
+      <w:r>
+        <w:rPr>
+          <w:rFonts w:ascii="Calibri" w:hAnsi="Calibri"/>
+          <w:b w:val="0"/>
+          <w:i w:val="0"/>
+          <w:color w:val="1E293B"/>
+          <w:sz w:val="22"/>
+        </w:rPr>
+        <w:t>Running the 3 containers (Database, Backend, Frontend) directly in production with Docker.</w:t>
+        <w:br/>
+      </w:r>
+      <w:r>
+        <w:rPr>
+          <w:rFonts w:ascii="Calibri" w:hAnsi="Calibri"/>
+          <w:b/>
+          <w:i w:val="0"/>
+          <w:color w:val="1E293B"/>
+          <w:sz w:val="22"/>
+        </w:rPr>
+        <w:t xml:space="preserve">• Custom Domain &amp; SSL: </w:t>
+      </w:r>
+      <w:r>
+        <w:rPr>
+          <w:rFonts w:ascii="Calibri" w:hAnsi="Calibri"/>
+          <w:b w:val="0"/>
+          <w:i w:val="0"/>
+          <w:color w:val="1E293B"/>
+          <w:sz w:val="22"/>
+        </w:rPr>
+        <w:t>Configured DNS A-Records to point directly to the VPS with automatic HTTPS encryption.</w:t>
       </w:r>
     </w:p>
     <w:p>
       <w:pPr>
-        <w:spacing w:after="40"/>
-        <w:ind w:left="288"/>
+        <w:spacing w:before="80"/>
       </w:pPr>
       <w:r>
         <w:rPr>
           <w:rFonts w:ascii="Calibri" w:hAnsi="Calibri"/>
           <w:b/>
           <w:i w:val="0"/>
-          <w:color w:val="282828"/>
+          <w:color w:val="1E293B"/>
           <w:sz w:val="22"/>
         </w:rPr>
-        <w:t xml:space="preserve">• Cloud VPS Server: </w:t>
+        <w:t>• Clickable Live Domain Links:</w:t>
+        <w:br/>
       </w:r>
       <w:r>
         <w:rPr>
           <w:rFonts w:ascii="Calibri" w:hAnsi="Calibri"/>
           <w:b w:val="0"/>
           <w:i w:val="0"/>
-          <w:color w:val="282828"/>
+          <w:color w:val="1E293B"/>
           <w:sz w:val="22"/>
         </w:rPr>
-        <w:t>Ubuntu 24.04 LTS (Hostinger Cloud VPS), Public IPv4: 147.93.111.196.</w:t>
+        <w:t xml:space="preserve">  🌐 Live Web Application: </w:t>
       </w:r>
-    </w:p>
-    <w:p>
-      <w:pPr>
-        <w:spacing w:after="40"/>
-        <w:ind w:left="288"/>
-      </w:pPr>
-      <w:r>
-        <w:rPr>
-          <w:rFonts w:ascii="Calibri" w:hAnsi="Calibri"/>
-          <w:b/>
-          <w:i w:val="0"/>
-          <w:color w:val="282828"/>
-          <w:sz w:val="22"/>
-        </w:rPr>
-        <w:t xml:space="preserve">• Custom Domain: </w:t>
-      </w:r>
+      <w:hyperlink r:id="rId15" w:history="1">
+        <w:r>
+          <w:rPr>
+            <w:color w:val="1679AB"/>
+            <w:u w:val="single"/>
+          </w:rPr>
+          <w:t>https://khmerapi.lorndavid.online</w:t>
+        </w:r>
+      </w:hyperlink>
       <w:r>
         <w:rPr>
           <w:rFonts w:ascii="Calibri" w:hAnsi="Calibri"/>
           <w:b w:val="0"/>
           <w:i w:val="0"/>
-          <w:color w:val="282828"/>
+          <w:color w:val="1E293B"/>
           <w:sz w:val="22"/>
         </w:rPr>
-        <w:t>Configured DNS A-Record for khmerapi.lorndavid.online pointing to the VPS IP.</w:t>
+        <w:t xml:space="preserve"> (or </w:t>
       </w:r>
-    </w:p>
-    <w:p>
-      <w:pPr>
-        <w:spacing w:after="40"/>
-        <w:ind w:left="288"/>
-      </w:pPr>
-      <w:r>
-        <w:rPr>
-          <w:rFonts w:ascii="Calibri" w:hAnsi="Calibri"/>
-          <w:b/>
-          <w:i w:val="0"/>
-          <w:color w:val="282828"/>
-          <w:sz w:val="22"/>
-        </w:rPr>
-        <w:t xml:space="preserve">• Nginx Proxy Manager Container: </w:t>
-      </w:r>
+      <w:hyperlink r:id="rId16" w:history="1">
+        <w:r>
+          <w:rPr>
+            <w:color w:val="1679AB"/>
+            <w:u w:val="single"/>
+          </w:rPr>
+          <w:t>https://khmer.lorndavid.online</w:t>
+        </w:r>
+      </w:hyperlink>
       <w:r>
         <w:rPr>
           <w:rFonts w:ascii="Calibri" w:hAnsi="Calibri"/>
           <w:b w:val="0"/>
           <w:i w:val="0"/>
-          <w:color w:val="282828"/>
+          <w:color w:val="1E293B"/>
           <w:sz w:val="22"/>
         </w:rPr>
-        <w:t>Deployed official 'jc21/nginx-proxy-manager:latest' on ports 80, 81 (Admin Web UI), and 443 (HTTPS).</w:t>
+        <w:t>)</w:t>
+        <w:br/>
+        <w:t xml:space="preserve">  📡 Live REST API Endpoint: </w:t>
       </w:r>
-    </w:p>
-    <w:p>
-      <w:pPr>
-        <w:spacing w:after="40"/>
-        <w:ind w:left="288"/>
-      </w:pPr>
-      <w:r>
-        <w:rPr>
-          <w:rFonts w:ascii="Calibri" w:hAnsi="Calibri"/>
-          <w:b/>
-          <w:i w:val="0"/>
-          <w:color w:val="282828"/>
-          <w:sz w:val="22"/>
-        </w:rPr>
-        <w:t xml:space="preserve">• SSL &amp; Security: </w:t>
-      </w:r>
+      <w:hyperlink r:id="rId17" w:history="1">
+        <w:r>
+          <w:rPr>
+            <w:color w:val="1679AB"/>
+            <w:u w:val="single"/>
+          </w:rPr>
+          <w:t>https://khmerapi.lorndavid.online/v1/provinces</w:t>
+        </w:r>
+      </w:hyperlink>
       <w:r>
         <w:rPr>
           <w:rFonts w:ascii="Calibri" w:hAnsi="Calibri"/>
           <w:b w:val="0"/>
           <w:i w:val="0"/>
-          <w:color w:val="282828"/>
+          <w:color w:val="1E293B"/>
           <w:sz w:val="22"/>
         </w:rPr>
-        <w:t>Automated Let's Encrypt SSL certificate with HTTP-to-HTTPS forced redirection, HSTS, and HTTP/2 support.</w:t>
+        <w:br/>
+        <w:t xml:space="preserve">  🩺 Live API Health Status: </w:t>
       </w:r>
+      <w:hyperlink r:id="rId18" w:history="1">
+        <w:r>
+          <w:rPr>
+            <w:color w:val="1679AB"/>
+            <w:u w:val="single"/>
+          </w:rPr>
+          <w:t>https://khmerapi.lorndavid.online/health</w:t>
+        </w:r>
+      </w:hyperlink>
     </w:p>
     <w:p>
       <w:pPr>
-        <w:spacing w:after="40"/>
-        <w:ind w:left="288"/>
-      </w:pPr>
-      <w:r>
-        <w:rPr>
-          <w:rFonts w:ascii="Calibri" w:hAnsi="Calibri"/>
-          <w:b/>
-          <w:i w:val="0"/>
-          <w:color w:val="282828"/>
-          <w:sz w:val="22"/>
-        </w:rPr>
-        <w:t xml:space="preserve">• Proxy Routing: </w:t>
-      </w:r>
-      <w:r>
-        <w:rPr>
-          <w:rFonts w:ascii="Calibri" w:hAnsi="Calibri"/>
-          <w:b w:val="0"/>
-          <w:i w:val="0"/>
-          <w:color w:val="282828"/>
-          <w:sz w:val="22"/>
-        </w:rPr>
-        <w:t>Forwarding https://khmerapi.lorndavid.online directly to container 'khmerapi-frontend:80'.</w:t>
-      </w:r>
-    </w:p>
-    <w:p>
-      <w:pPr>
-        <w:spacing w:before="120"/>
-      </w:pPr>
-      <w:r>
-        <w:rPr>
-          <w:rFonts w:ascii="Calibri" w:hAnsi="Calibri"/>
-          <w:b/>
-          <w:i w:val="0"/>
-          <w:color w:val="282828"/>
-          <w:sz w:val="22"/>
-        </w:rPr>
-        <w:t>• Live Cloud Production URLs:</w:t>
-      </w:r>
-    </w:p>
-    <w:tbl>
-      <w:tblPr>
-        <w:tblW w:type="auto" w:w="0"/>
-        <w:jc w:val="center"/>
-        <w:tblLook w:firstColumn="1" w:firstRow="1" w:lastColumn="0" w:lastRow="0" w:noHBand="0" w:noVBand="1" w:val="04A0"/>
-      </w:tblPr>
-      <w:tblGrid>
-        <w:gridCol w:w="9936"/>
-      </w:tblGrid>
-      <w:tr>
-        <w:tc>
-          <w:tcPr>
-            <w:tcW w:type="dxa" w:w="9792"/>
-            <w:shd w:fill="F3F4F6"/>
-            <w:tcBorders>
-              <w:top w:val="single" w:sz="4" w:space="0" w:color="CBD5E1"/>
-              <w:left w:val="single" w:sz="18" w:space="0" w:color="1679AB"/>
-              <w:bottom w:val="single" w:sz="4" w:space="0" w:color="CBD5E1"/>
-              <w:right w:val="single" w:sz="4" w:space="0" w:color="CBD5E1"/>
-            </w:tcBorders>
-          </w:tcPr>
-          <w:p>
-            <w:pPr>
-              <w:spacing w:before="80" w:after="80"/>
-              <w:ind w:left="144"/>
-            </w:pPr>
-            <w:r>
-              <w:rPr>
-                <w:rFonts w:ascii="Consolas" w:hAnsi="Consolas"/>
-                <w:b w:val="0"/>
-                <w:i w:val="0"/>
-                <w:color w:val="1E293B"/>
-                <w:sz w:val="19"/>
-              </w:rPr>
-              <w:t>🌐 Live Web Application:  https://khmerapi.lorndavid.online</w:t>
-              <w:br/>
-              <w:t>📡 Live API Base URL:     https://khmerapi.lorndavid.online/v1/provinces</w:t>
-              <w:br/>
-              <w:t>🩺 Live API Health:       https://khmerapi.lorndavid.online/health</w:t>
-              <w:br/>
-              <w:t>🔐 Nginx Proxy Manager:   http://147.93.111.196:81</w:t>
-            </w:r>
-          </w:p>
-        </w:tc>
-      </w:tr>
-    </w:tbl>
-    <w:p>
-      <w:pPr>
-        <w:spacing w:after="80"/>
-      </w:pPr>
-    </w:p>
-    <w:p>
-      <w:pPr>
-        <w:spacing w:before="280" w:after="80"/>
-      </w:pPr>
-      <w:r>
-        <w:rPr>
-          <w:rFonts w:ascii="Calibri" w:hAnsi="Calibri"/>
-          <w:b/>
-          <w:i w:val="0"/>
-          <w:color w:val="0F3460"/>
-          <w:sz w:val="28"/>
-        </w:rPr>
-        <w:t>5. Summary of Completed Objectives</w:t>
-      </w:r>
-    </w:p>
-    <w:p>
-      <w:pPr>
-        <w:spacing w:after="40"/>
-        <w:ind w:left="288"/>
-      </w:pPr>
-      <w:r>
-        <w:rPr>
-          <w:rFonts w:ascii="Calibri" w:hAnsi="Calibri"/>
-          <w:b/>
-          <w:i w:val="0"/>
-          <w:color w:val="0F3460"/>
-          <w:sz w:val="22"/>
-        </w:rPr>
-        <w:t>✅ 1.1 Database Container created, configured, and published to Docker Hub.</w:t>
-      </w:r>
-    </w:p>
-    <w:p>
-      <w:pPr>
-        <w:spacing w:after="40"/>
-        <w:ind w:left="288"/>
-      </w:pPr>
-      <w:r>
-        <w:rPr>
-          <w:rFonts w:ascii="Calibri" w:hAnsi="Calibri"/>
-          <w:b/>
-          <w:i w:val="0"/>
-          <w:color w:val="0F3460"/>
-          <w:sz w:val="22"/>
-        </w:rPr>
-        <w:t>✅ 1.2 Backend REST API Container created, configured, and published to Docker Hub.</w:t>
-      </w:r>
-    </w:p>
-    <w:p>
-      <w:pPr>
-        <w:spacing w:after="40"/>
-        <w:ind w:left="288"/>
-      </w:pPr>
-      <w:r>
-        <w:rPr>
-          <w:rFonts w:ascii="Calibri" w:hAnsi="Calibri"/>
-          <w:b/>
-          <w:i w:val="0"/>
-          <w:color w:val="0F3460"/>
-          <w:sz w:val="22"/>
-        </w:rPr>
-        <w:t>✅ 1.3 Frontend Web Application Container created, configured, and published to Docker Hub.</w:t>
-      </w:r>
-    </w:p>
-    <w:p>
-      <w:pPr>
-        <w:spacing w:after="40"/>
-        <w:ind w:left="288"/>
-      </w:pPr>
-      <w:r>
-        <w:rPr>
-          <w:rFonts w:ascii="Calibri" w:hAnsi="Calibri"/>
-          <w:b/>
-          <w:i w:val="0"/>
-          <w:color w:val="0F3460"/>
-          <w:sz w:val="22"/>
-        </w:rPr>
-        <w:t>✅ 2.1 Free Domain &amp; Cloud VPS configured with DNS A-Records.</w:t>
-      </w:r>
-    </w:p>
-    <w:p>
-      <w:pPr>
-        <w:spacing w:after="40"/>
-        <w:ind w:left="288"/>
-      </w:pPr>
-      <w:r>
-        <w:rPr>
-          <w:rFonts w:ascii="Calibri" w:hAnsi="Calibri"/>
-          <w:b/>
-          <w:i w:val="0"/>
-          <w:color w:val="0F3460"/>
-          <w:sz w:val="22"/>
-        </w:rPr>
-        <w:t>✅ 2.2 Live Web Application hosted with Docker and Nginx Proxy Manager with Let's Encrypt SSL.</w:t>
-      </w:r>
-    </w:p>
-    <w:p>
-      <w:pPr>
-        <w:spacing w:after="40"/>
-        <w:ind w:left="288"/>
-      </w:pPr>
-      <w:r>
-        <w:rPr>
-          <w:rFonts w:ascii="Calibri" w:hAnsi="Calibri"/>
-          <w:b/>
-          <w:i w:val="0"/>
-          <w:color w:val="0F3460"/>
-          <w:sz w:val="22"/>
-        </w:rPr>
-        <w:t>✅ Turnkey evaluation supported for teacher on Docker Desktop via 'docker compose up -d'.</w:t>
-      </w:r>
-    </w:p>
-    <w:p>
-      <w:pPr>
-        <w:spacing w:before="720" w:after="240"/>
+        <w:spacing w:before="560" w:after="160"/>
         <w:jc w:val="center"/>
       </w:pPr>
       <w:r>

</xml_diff>